<commit_message>
Student handouts: dismissal order and Chromebooks; lunch on the six-step process
</commit_message>
<xml_diff>
--- a/resources/systems/procedures/schoolwide/handouts/dismissal-student-handout.docx
+++ b/resources/systems/procedures/schoolwide/handouts/dismissal-student-handout.docx
@@ -145,7 +145,7 @@
           <w:sz w:val="21"/>
           <w:szCs w:val="21"/>
         </w:rPr>
-        <w:t xml:space="preserve">Computer and pencil stay </w:t>
+        <w:t xml:space="preserve">Chromebook closed on my desk; my pencil stays </w:t>
       </w:r>
       <w:r>
         <w:rPr>
@@ -154,7 +154,7 @@
           <w:sz w:val="21"/>
           <w:szCs w:val="21"/>
         </w:rPr>
-        <w:t xml:space="preserve">on my desk.</w:t>
+        <w:t xml:space="preserve">on my desk. When my group is called, I plug my Chromebook into my number in the cart.</w:t>
       </w:r>
     </w:p>
     <w:p>
@@ -191,7 +191,7 @@
           <w:sz w:val="21"/>
           <w:szCs w:val="21"/>
         </w:rPr>
-        <w:t xml:space="preserve">stand, gather my things, walk out — no lining up at the door.</w:t>
+        <w:t xml:space="preserve">stand, gather my things, plug in my Chromebook at my number, walk out. No lining up at the door.</w:t>
       </w:r>
     </w:p>
     <w:p>
@@ -265,7 +265,7 @@
           <w:sz w:val="21"/>
           <w:szCs w:val="21"/>
         </w:rPr>
-        <w:t xml:space="preserve">wait for my group to be called (6–8, then 3–5, then K–2), then walk with my teacher.</w:t>
+        <w:t xml:space="preserve">wait for my group to be called (K–2, then 3–5, then 6–8), plug in my Chromebook at my number, then walk with my teacher.</w:t>
       </w:r>
     </w:p>
     <w:p>
@@ -332,7 +332,7 @@
           <w:sz w:val="21"/>
           <w:szCs w:val="21"/>
         </w:rPr>
-        <w:t xml:space="preserve">Stay seated until my group is called.  Computer and pencil stay on the desk.</w:t>
+        <w:t xml:space="preserve">Stay seated until my group is called.  Chromebook goes in the cart at my number.</w:t>
       </w:r>
     </w:p>
     <w:tbl>

</xml_diff>